<commit_message>
Updated to latest PIP data and confirm consistency
</commit_message>
<xml_diff>
--- a/Poverty Aggregates Dashboard Blog Article (Draft).docx
+++ b/Poverty Aggregates Dashboard Blog Article (Draft).docx
@@ -2,11 +2,1214 @@
 <file path=word/document.xml><?xml version="1.0" encoding="utf-8"?>
 <w:document xmlns:wpc="http://schemas.microsoft.com/office/word/2010/wordprocessingCanvas" xmlns:cx="http://schemas.microsoft.com/office/drawing/2014/chartex" xmlns:cx1="http://schemas.microsoft.com/office/drawing/2015/9/8/chartex" xmlns:cx2="http://schemas.microsoft.com/office/drawing/2015/10/21/chartex" xmlns:cx3="http://schemas.microsoft.com/office/drawing/2016/5/9/chartex" xmlns:cx4="http://schemas.microsoft.com/office/drawing/2016/5/10/chartex" xmlns:cx5="http://schemas.microsoft.com/office/drawing/2016/5/11/chartex" xmlns:cx6="http://schemas.microsoft.com/office/drawing/2016/5/12/chartex" xmlns:cx7="http://schemas.microsoft.com/office/drawing/2016/5/13/chartex" xmlns:cx8="http://schemas.microsoft.com/office/drawing/2016/5/14/chartex" xmlns:mc="http://schemas.openxmlformats.org/markup-compatibility/2006" xmlns:aink="http://schemas.microsoft.com/office/drawing/2016/ink" xmlns:am3d="http://schemas.microsoft.com/office/drawing/2017/model3d" xmlns:o="urn:schemas-microsoft-com:office:office" xmlns:oel="http://schemas.microsoft.com/office/2019/extlst" xmlns:r="http://schemas.openxmlformats.org/officeDocument/2006/relationships" xmlns:m="http://schemas.openxmlformats.org/officeDocument/2006/math" xmlns:v="urn:schemas-microsoft-com:vml" xmlns:wp14="http://schemas.microsoft.com/office/word/2010/wordprocessingDrawing" xmlns:wp="http://schemas.openxmlformats.org/drawingml/2006/wordprocessingDrawing" xmlns:w10="urn:schemas-microsoft-com:office:word" xmlns:w="http://schemas.openxmlformats.org/wordprocessingml/2006/main" xmlns:w14="http://schemas.microsoft.com/office/word/2010/wordml" xmlns:w15="http://schemas.microsoft.com/office/word/2012/wordml" xmlns:w16cex="http://schemas.microsoft.com/office/word/2018/wordml/cex" xmlns:w16cid="http://schemas.microsoft.com/office/word/2016/wordml/cid" xmlns:w16="http://schemas.microsoft.com/office/word/2018/wordml" xmlns:w16du="http://schemas.microsoft.com/office/word/2023/wordml/word16du" xmlns:w16sdtdh="http://schemas.microsoft.com/office/word/2020/wordml/sdtdatahash" xmlns:w16sdtfl="http://schemas.microsoft.com/office/word/2024/wordml/sdtformatlock" xmlns:w16se="http://schemas.microsoft.com/office/word/2015/wordml/symex" xmlns:wpg="http://schemas.microsoft.com/office/word/2010/wordprocessingGroup" xmlns:wpi="http://schemas.microsoft.com/office/word/2010/wordprocessingInk" xmlns:wne="http://schemas.microsoft.com/office/word/2006/wordml" xmlns:wps="http://schemas.microsoft.com/office/word/2010/wordprocessingShape" mc:Ignorable="w14 w15 w16se w16cid w16 w16cex w16sdtdh w16sdtfl w16du wp14">
   <w:body>
-    <w:p/>
+    <w:p>
+      <w:pPr>
+        <w:jc w:val="center"/>
+        <w:rPr>
+          <w:b/>
+          <w:bCs/>
+        </w:rPr>
+      </w:pPr>
+      <w:r>
+        <w:rPr>
+          <w:b/>
+          <w:bCs/>
+        </w:rPr>
+        <w:t xml:space="preserve">Tracking Poverty </w:t>
+      </w:r>
+      <w:r>
+        <w:rPr>
+          <w:b/>
+          <w:bCs/>
+        </w:rPr>
+        <w:t>Across</w:t>
+      </w:r>
+      <w:r>
+        <w:rPr>
+          <w:b/>
+          <w:bCs/>
+        </w:rPr>
+        <w:t xml:space="preserve"> Groupings: </w:t>
+      </w:r>
+    </w:p>
+    <w:p>
+      <w:pPr>
+        <w:jc w:val="center"/>
+        <w:rPr>
+          <w:b/>
+          <w:bCs/>
+        </w:rPr>
+      </w:pPr>
+      <w:r>
+        <w:rPr>
+          <w:b/>
+          <w:bCs/>
+        </w:rPr>
+        <w:t>Insights from the World Bank’s Poverty Aggregate Dashboard</w:t>
+      </w:r>
+    </w:p>
+    <w:p>
+      <w:pPr>
+        <w:jc w:val="center"/>
+      </w:pPr>
+      <w:r>
+        <w:t>Nishant Yonzan</w:t>
+      </w:r>
+      <w:r>
+        <w:t xml:space="preserve">, </w:t>
+      </w:r>
+      <w:r>
+        <w:t xml:space="preserve">Zander Prinsloo, </w:t>
+      </w:r>
+      <w:r>
+        <w:t xml:space="preserve">Jing Xie, </w:t>
+      </w:r>
+      <w:r>
+        <w:t xml:space="preserve">Kayley Ashlynn </w:t>
+      </w:r>
+      <w:proofErr w:type="spellStart"/>
+      <w:r>
+        <w:t>Watsc</w:t>
+      </w:r>
+      <w:proofErr w:type="spellEnd"/>
+      <w:r>
+        <w:t xml:space="preserve">, </w:t>
+      </w:r>
+      <w:r>
+        <w:t>Martha Celmira Viveros Mendoza</w:t>
+      </w:r>
+      <w:r>
+        <w:t xml:space="preserve">, </w:t>
+      </w:r>
+      <w:r>
+        <w:t>Christoph Lakner</w:t>
+      </w:r>
+    </w:p>
+    <w:p>
+      <w:pPr>
+        <w:ind w:left="360"/>
+      </w:pPr>
+      <w:r>
+        <w:t>Are poverty rate</w:t>
+      </w:r>
+      <w:r>
+        <w:t>s</w:t>
+      </w:r>
+      <w:r>
+        <w:t xml:space="preserve"> decreasing in all regions</w:t>
+      </w:r>
+      <w:r>
+        <w:t xml:space="preserve"> or income groups</w:t>
+      </w:r>
+      <w:r>
+        <w:t xml:space="preserve">? Are they changing </w:t>
+      </w:r>
+      <w:r>
+        <w:t>at</w:t>
+      </w:r>
+      <w:r>
+        <w:t xml:space="preserve"> the same rate? What are the regional impact</w:t>
+      </w:r>
+      <w:r>
+        <w:t>s</w:t>
+      </w:r>
+      <w:r>
+        <w:t xml:space="preserve"> of recent </w:t>
+      </w:r>
+      <w:r>
+        <w:t>crises,</w:t>
+      </w:r>
+      <w:r>
+        <w:t xml:space="preserve"> such as the COVID-19 pandemic and the Russia’s Invasion </w:t>
+      </w:r>
+      <w:r>
+        <w:t>of</w:t>
+      </w:r>
+      <w:r>
+        <w:t xml:space="preserve"> Ukraine</w:t>
+      </w:r>
+      <w:r>
+        <w:t>, on poverty</w:t>
+      </w:r>
+      <w:r>
+        <w:t xml:space="preserve">? </w:t>
+      </w:r>
+    </w:p>
+    <w:p>
+      <w:pPr>
+        <w:ind w:left="360"/>
+      </w:pPr>
+      <w:r>
+        <w:t xml:space="preserve">The Poverty and Inequality Platform (PIP) provides quick access to the World Bank’s estimates of poverty, inequality, and shared prosperity. The estimates of PIP are based on country-level household data that use either consumption or income welfare aggregates, </w:t>
+      </w:r>
+      <w:r>
+        <w:t>offering the most complete collection of poverty headcount estimates derived directly from household surveys</w:t>
+      </w:r>
+      <w:r>
+        <w:t xml:space="preserve">. </w:t>
+      </w:r>
+    </w:p>
+    <w:p>
+      <w:pPr>
+        <w:ind w:left="360"/>
+      </w:pPr>
+      <w:r>
+        <w:t>The new PIP Poverty Aggregate Dashboard (</w:t>
+      </w:r>
+      <w:r>
+        <w:rPr>
+          <w:highlight w:val="yellow"/>
+        </w:rPr>
+        <w:t>Add Link</w:t>
+      </w:r>
+      <w:r>
+        <w:t xml:space="preserve">) </w:t>
+      </w:r>
+      <w:r>
+        <w:t>offers</w:t>
+      </w:r>
+      <w:r>
+        <w:t xml:space="preserve"> an interactive visualization that presents poverty statistics for various groups that are not currently reported on the </w:t>
+      </w:r>
+      <w:r>
+        <w:t>PIP but</w:t>
+      </w:r>
+      <w:r>
+        <w:t xml:space="preserve"> are </w:t>
+      </w:r>
+      <w:r>
+        <w:t>frequently</w:t>
+      </w:r>
+      <w:r>
+        <w:t xml:space="preserve"> used in reports and analyses. The Dashboard uses the latest release of PIP data (September 2025) and applies the 2021 </w:t>
+      </w:r>
+      <w:r>
+        <w:t>Purchasing Power Party (</w:t>
+      </w:r>
+      <w:r>
+        <w:t>PPPs</w:t>
+      </w:r>
+      <w:r>
+        <w:t>)</w:t>
+      </w:r>
+      <w:r>
+        <w:t xml:space="preserve">. </w:t>
+      </w:r>
+    </w:p>
+    <w:p>
+      <w:pPr>
+        <w:ind w:left="360"/>
+      </w:pPr>
+      <w:r>
+        <w:t xml:space="preserve">The </w:t>
+      </w:r>
+      <w:r>
+        <w:t>d</w:t>
+      </w:r>
+      <w:r>
+        <w:t xml:space="preserve">ashboard </w:t>
+      </w:r>
+      <w:r>
+        <w:t xml:space="preserve">presents both </w:t>
+      </w:r>
+      <w:r>
+        <w:t xml:space="preserve">the </w:t>
+      </w:r>
+      <w:r>
+        <w:t xml:space="preserve">poverty rate and </w:t>
+      </w:r>
+      <w:r>
+        <w:t xml:space="preserve">the </w:t>
+      </w:r>
+      <w:r>
+        <w:t xml:space="preserve">number </w:t>
+      </w:r>
+      <w:r>
+        <w:t xml:space="preserve">of people living in poverty using </w:t>
+      </w:r>
+      <w:r>
+        <w:t xml:space="preserve">three global poverty lines: $3.00, $4.20, and $8.20. </w:t>
+      </w:r>
+      <w:r>
+        <w:t>Users can explore</w:t>
+      </w:r>
+      <w:r>
+        <w:t xml:space="preserve"> poverty indicators </w:t>
+      </w:r>
+      <w:r>
+        <w:t>across</w:t>
+      </w:r>
+      <w:r>
+        <w:t xml:space="preserve"> four </w:t>
+      </w:r>
+      <w:r>
+        <w:t xml:space="preserve">key </w:t>
+      </w:r>
+      <w:r>
+        <w:t>groupings: (</w:t>
+      </w:r>
+      <w:proofErr w:type="spellStart"/>
+      <w:r>
+        <w:t>i</w:t>
+      </w:r>
+      <w:proofErr w:type="spellEnd"/>
+      <w:r>
+        <w:t xml:space="preserve">) Geographic Region; (ii) World Bank Income Groups; (iii) World Bank Fragility Classification (FCV); and (iv) </w:t>
+      </w:r>
+      <w:r>
+        <w:t>International Development Association (</w:t>
+      </w:r>
+      <w:r>
+        <w:t>IDA</w:t>
+      </w:r>
+      <w:r>
+        <w:t>)</w:t>
+      </w:r>
+      <w:r>
+        <w:t xml:space="preserve"> Eligibility Status.</w:t>
+      </w:r>
+    </w:p>
+    <w:p>
+      <w:pPr>
+        <w:ind w:left="360"/>
+      </w:pPr>
+      <w:r>
+        <w:t xml:space="preserve">This blog provides guidance on how to use the dashboard and briefly describes its charts. Users can view and download a range of figures and tables, as well as the data underlying the visualizations by selecting their groupings or specific categories within each grouping. </w:t>
+      </w:r>
+    </w:p>
+    <w:p>
+      <w:pPr>
+        <w:ind w:firstLine="360"/>
+        <w:rPr>
+          <w:b/>
+          <w:bCs/>
+        </w:rPr>
+      </w:pPr>
+      <w:r>
+        <w:rPr>
+          <w:b/>
+          <w:bCs/>
+        </w:rPr>
+        <w:t xml:space="preserve">Changes in World Bank Group Regional Classification </w:t>
+      </w:r>
+    </w:p>
+    <w:p>
+      <w:pPr>
+        <w:ind w:left="360"/>
+      </w:pPr>
+      <w:r>
+        <w:t xml:space="preserve">With the September 2025 update, PIP’s geographical regions now align with the World Bank’s official regional classification. </w:t>
+      </w:r>
+      <w:r>
+        <w:t>Compared</w:t>
+      </w:r>
+      <w:r>
+        <w:t xml:space="preserve"> to </w:t>
+      </w:r>
+      <w:r>
+        <w:t xml:space="preserve">earlier </w:t>
+      </w:r>
+      <w:r>
+        <w:t xml:space="preserve">definitions, </w:t>
+      </w:r>
+      <w:r>
+        <w:t xml:space="preserve">two key changes were introduced. </w:t>
+      </w:r>
+    </w:p>
+    <w:p>
+      <w:pPr>
+        <w:ind w:left="360"/>
+      </w:pPr>
+      <w:r>
+        <w:t xml:space="preserve">First, PIP previously excluded some high-income economies from regional aggregates and placed them into a separate group </w:t>
+      </w:r>
+      <w:r>
+        <w:t xml:space="preserve">called </w:t>
+      </w:r>
+      <w:r>
+        <w:t xml:space="preserve">“Other High-income”. This grouping no </w:t>
+      </w:r>
+      <w:r>
+        <w:lastRenderedPageBreak/>
+        <w:t xml:space="preserve">longer </w:t>
+      </w:r>
+      <w:r>
+        <w:t>exists,</w:t>
+      </w:r>
+      <w:r>
+        <w:t xml:space="preserve"> and</w:t>
+      </w:r>
+      <w:r>
+        <w:t xml:space="preserve"> these countries were reassigned to their respective regions</w:t>
+      </w:r>
+      <w:r>
+        <w:t xml:space="preserve">. Additionally, a new </w:t>
+      </w:r>
+      <w:r>
+        <w:rPr>
+          <w:i/>
+          <w:iCs/>
+        </w:rPr>
+        <w:t>North America</w:t>
+      </w:r>
+      <w:r>
+        <w:t xml:space="preserve"> region now appears for Canada and United States. </w:t>
+      </w:r>
+    </w:p>
+    <w:p>
+      <w:pPr>
+        <w:ind w:left="360"/>
+      </w:pPr>
+      <w:r>
+        <w:t xml:space="preserve">Second, this updated regional </w:t>
+      </w:r>
+      <w:r>
+        <w:t>groupings</w:t>
+      </w:r>
+      <w:r>
+        <w:t xml:space="preserve"> reflected the recent reclassification of Afghanistan and Pakistan from </w:t>
+      </w:r>
+      <w:r>
+        <w:rPr>
+          <w:i/>
+          <w:iCs/>
+        </w:rPr>
+        <w:t>South Asia</w:t>
+      </w:r>
+      <w:r>
+        <w:t xml:space="preserve"> to </w:t>
+      </w:r>
+      <w:r>
+        <w:rPr>
+          <w:i/>
+          <w:iCs/>
+        </w:rPr>
+        <w:t>Middle East &amp; North Africa</w:t>
+      </w:r>
+      <w:r>
+        <w:t xml:space="preserve"> region</w:t>
+      </w:r>
+      <w:r>
+        <w:t xml:space="preserve">. Due to this reclassification, the </w:t>
+      </w:r>
+      <w:r>
+        <w:rPr>
+          <w:i/>
+          <w:iCs/>
+        </w:rPr>
+        <w:t>Middle East &amp; North Africa</w:t>
+      </w:r>
+      <w:r>
+        <w:t xml:space="preserve"> region </w:t>
+      </w:r>
+      <w:r>
+        <w:t>has been</w:t>
+      </w:r>
+      <w:r>
+        <w:t xml:space="preserve"> renamed </w:t>
+      </w:r>
+      <w:r>
+        <w:rPr>
+          <w:i/>
+          <w:iCs/>
+        </w:rPr>
+        <w:t>Middle East, North Africa, Afghanistan &amp; Pakistan</w:t>
+      </w:r>
+      <w:r>
+        <w:t xml:space="preserve">. </w:t>
+      </w:r>
+    </w:p>
+    <w:p>
+      <w:pPr>
+        <w:ind w:firstLine="360"/>
+        <w:rPr>
+          <w:b/>
+          <w:bCs/>
+        </w:rPr>
+      </w:pPr>
+      <w:r>
+        <w:rPr>
+          <w:b/>
+          <w:bCs/>
+        </w:rPr>
+        <w:t>Compar</w:t>
+      </w:r>
+      <w:r>
+        <w:rPr>
+          <w:b/>
+          <w:bCs/>
+        </w:rPr>
+        <w:t>e</w:t>
+      </w:r>
+      <w:r>
+        <w:rPr>
+          <w:b/>
+          <w:bCs/>
+        </w:rPr>
+        <w:t xml:space="preserve"> Poverty Headcount and the Number of Poor within </w:t>
+      </w:r>
+      <w:r>
+        <w:rPr>
+          <w:b/>
+          <w:bCs/>
+        </w:rPr>
+        <w:t>Selected</w:t>
+      </w:r>
+      <w:r>
+        <w:rPr>
+          <w:b/>
+          <w:bCs/>
+        </w:rPr>
+        <w:t xml:space="preserve"> </w:t>
+      </w:r>
+      <w:r>
+        <w:rPr>
+          <w:b/>
+          <w:bCs/>
+        </w:rPr>
+        <w:t>G</w:t>
+      </w:r>
+      <w:r>
+        <w:rPr>
+          <w:b/>
+          <w:bCs/>
+        </w:rPr>
+        <w:t xml:space="preserve">rouping </w:t>
+      </w:r>
+    </w:p>
+    <w:p>
+      <w:pPr>
+        <w:ind w:left="360"/>
+      </w:pPr>
+      <w:r>
+        <w:t xml:space="preserve">The first tab allows users to select a group, specific categories within the selected group, and poverty line (in 2021 PPP) to visualize historical poverty trends. The left panel presents poverty headcount </w:t>
+      </w:r>
+      <w:r>
+        <w:t>ratio,</w:t>
+      </w:r>
+      <w:r>
+        <w:t xml:space="preserve"> and the right panel presents </w:t>
+      </w:r>
+      <w:r>
+        <w:t>the number</w:t>
+      </w:r>
+      <w:r>
+        <w:t xml:space="preserve"> of poor by region for the selected input. </w:t>
+      </w:r>
+    </w:p>
+    <w:p>
+      <w:pPr>
+        <w:ind w:left="360"/>
+      </w:pPr>
+      <w:r>
+        <w:t xml:space="preserve">For example, the </w:t>
+      </w:r>
+      <w:r>
+        <w:t xml:space="preserve">chart </w:t>
+      </w:r>
+      <w:r>
+        <w:t xml:space="preserve">below shows both poverty indicators </w:t>
+      </w:r>
+      <w:r>
+        <w:t>using the</w:t>
+      </w:r>
+      <w:r>
+        <w:t xml:space="preserve"> extreme poverty line by region </w:t>
+      </w:r>
+      <w:r>
+        <w:t xml:space="preserve">with </w:t>
+      </w:r>
+      <w:r>
+        <w:t xml:space="preserve">new regional classification. We can </w:t>
+      </w:r>
+      <w:r>
+        <w:t>observe a</w:t>
+      </w:r>
+      <w:r>
+        <w:t xml:space="preserve"> drastic </w:t>
+      </w:r>
+      <w:r>
+        <w:t xml:space="preserve">decline </w:t>
+      </w:r>
+      <w:r>
+        <w:t xml:space="preserve">in poverty rate in </w:t>
+      </w:r>
+      <w:r>
+        <w:rPr>
+          <w:i/>
+          <w:iCs/>
+        </w:rPr>
+        <w:t xml:space="preserve">East Asia and Pacific </w:t>
+      </w:r>
+      <w:r>
+        <w:t>with</w:t>
+      </w:r>
+      <w:r>
+        <w:t xml:space="preserve"> both indicators and Sub-Saharan Africa </w:t>
+      </w:r>
+      <w:r>
+        <w:t xml:space="preserve">continues to have </w:t>
+      </w:r>
+      <w:r>
+        <w:t xml:space="preserve">the highest poverty rate and </w:t>
+      </w:r>
+      <w:r>
+        <w:t xml:space="preserve">the largest number of people living in poverty. </w:t>
+      </w:r>
+    </w:p>
+    <w:p>
+      <w:pPr>
+        <w:ind w:left="360"/>
+        <w:jc w:val="center"/>
+        <w:rPr>
+          <w:b/>
+          <w:bCs/>
+        </w:rPr>
+      </w:pPr>
+      <w:r>
+        <w:rPr>
+          <w:b/>
+          <w:bCs/>
+        </w:rPr>
+        <w:t>Figure 1. Poverty Indicators by New Regional Classification</w:t>
+      </w:r>
+    </w:p>
+    <w:p>
+      <w:pPr>
+        <w:jc w:val="center"/>
+      </w:pPr>
+      <w:r>
+        <w:drawing>
+          <wp:inline distT="0" distB="0" distL="0" distR="0" wp14:anchorId="0AEA0801" wp14:editId="1957C694">
+            <wp:extent cx="5415280" cy="2013952"/>
+            <wp:effectExtent l="0" t="0" r="0" b="5715"/>
+            <wp:docPr id="51806146" name="Picture 1" descr="A graph of different colored lines&#10;&#10;AI-generated content may be incorrect."/>
+            <wp:cNvGraphicFramePr>
+              <a:graphicFrameLocks xmlns:a="http://schemas.openxmlformats.org/drawingml/2006/main" noChangeAspect="1"/>
+            </wp:cNvGraphicFramePr>
+            <a:graphic xmlns:a="http://schemas.openxmlformats.org/drawingml/2006/main">
+              <a:graphicData uri="http://schemas.openxmlformats.org/drawingml/2006/picture">
+                <pic:pic xmlns:pic="http://schemas.openxmlformats.org/drawingml/2006/picture">
+                  <pic:nvPicPr>
+                    <pic:cNvPr id="51806146" name="Picture 1" descr="A graph of different colored lines&#10;&#10;AI-generated content may be incorrect."/>
+                    <pic:cNvPicPr/>
+                  </pic:nvPicPr>
+                  <pic:blipFill>
+                    <a:blip r:embed="rId7"/>
+                    <a:stretch>
+                      <a:fillRect/>
+                    </a:stretch>
+                  </pic:blipFill>
+                  <pic:spPr>
+                    <a:xfrm>
+                      <a:off x="0" y="0"/>
+                      <a:ext cx="5418878" cy="2015290"/>
+                    </a:xfrm>
+                    <a:prstGeom prst="rect">
+                      <a:avLst/>
+                    </a:prstGeom>
+                  </pic:spPr>
+                </pic:pic>
+              </a:graphicData>
+            </a:graphic>
+          </wp:inline>
+        </w:drawing>
+      </w:r>
+    </w:p>
+    <w:p>
+      <w:pPr>
+        <w:jc w:val="center"/>
+        <w:rPr>
+          <w:i/>
+          <w:iCs/>
+        </w:rPr>
+      </w:pPr>
+      <w:r>
+        <w:rPr>
+          <w:i/>
+          <w:iCs/>
+        </w:rPr>
+        <w:t>Source: Poverty and Inequality Platform (September 2025, World Bank Group)</w:t>
+      </w:r>
+    </w:p>
+    <w:p>
+      <w:pPr>
+        <w:ind w:firstLine="360"/>
+        <w:rPr>
+          <w:b/>
+          <w:bCs/>
+        </w:rPr>
+      </w:pPr>
+      <w:r>
+        <w:rPr>
+          <w:b/>
+          <w:bCs/>
+        </w:rPr>
+        <w:t>Overlay Two Trends from Any Grouping to Reveal Differences Over Time</w:t>
+      </w:r>
+    </w:p>
+    <w:p>
+      <w:pPr>
+        <w:ind w:left="360"/>
+      </w:pPr>
+      <w:r>
+        <w:t>The second tab allows users to customize the panel by choosing two trends from any groupings and visualize divergences in trend</w:t>
+      </w:r>
+      <w:r>
+        <w:t>s</w:t>
+      </w:r>
+      <w:r>
+        <w:t xml:space="preserve"> over time. This chart could be especially useful to understand the impact of the new regional groupings </w:t>
+      </w:r>
+      <w:r>
+        <w:t>on</w:t>
+      </w:r>
+      <w:r>
+        <w:t xml:space="preserve"> </w:t>
+      </w:r>
+      <w:r>
+        <w:t xml:space="preserve">the trends of aggregate poverty indicators </w:t>
+      </w:r>
+      <w:r>
+        <w:t xml:space="preserve">and differences in </w:t>
+      </w:r>
+      <w:r>
+        <w:t xml:space="preserve">trend </w:t>
+      </w:r>
+      <w:r>
+        <w:t xml:space="preserve">with historical or latest definitions </w:t>
+      </w:r>
+      <w:r>
+        <w:t>in</w:t>
+      </w:r>
+      <w:r>
+        <w:t xml:space="preserve"> income, FCV, and IDA grouping. </w:t>
+      </w:r>
+    </w:p>
+    <w:p>
+      <w:pPr>
+        <w:ind w:left="360"/>
+      </w:pPr>
+      <w:r>
+        <w:lastRenderedPageBreak/>
+        <w:t xml:space="preserve">For instance, the chart panel below shows impacts </w:t>
+      </w:r>
+      <w:r>
+        <w:t>on</w:t>
+      </w:r>
+      <w:r>
+        <w:t xml:space="preserve"> extreme poverty rate and </w:t>
+      </w:r>
+      <w:r>
+        <w:t xml:space="preserve">the </w:t>
+      </w:r>
+      <w:r>
+        <w:t xml:space="preserve">population </w:t>
+      </w:r>
+      <w:r>
+        <w:t>living in</w:t>
+      </w:r>
+      <w:r>
+        <w:t xml:space="preserve"> extreme poverty after Afghanistan and Pakistan were added to the </w:t>
+      </w:r>
+      <w:r>
+        <w:rPr>
+          <w:i/>
+          <w:iCs/>
+        </w:rPr>
+        <w:t>Middle East and North Africa</w:t>
+      </w:r>
+      <w:r>
+        <w:t xml:space="preserve"> group. </w:t>
+      </w:r>
+      <w:r>
+        <w:t xml:space="preserve">In the chart, </w:t>
+      </w:r>
+      <w:r>
+        <w:t xml:space="preserve">Line A represents values with new grouping, while Line B represents old groupings. This chart shows an increase in both poverty indicators </w:t>
+      </w:r>
+      <w:r>
+        <w:t>under</w:t>
+      </w:r>
+      <w:r>
+        <w:t xml:space="preserve"> the new grouping. </w:t>
+      </w:r>
+    </w:p>
+    <w:p>
+      <w:pPr>
+        <w:jc w:val="center"/>
+        <w:rPr>
+          <w:b/>
+          <w:bCs/>
+        </w:rPr>
+      </w:pPr>
+      <w:r>
+        <w:rPr>
+          <w:b/>
+          <w:bCs/>
+        </w:rPr>
+        <w:t xml:space="preserve">Figure 2. </w:t>
+      </w:r>
+      <w:r>
+        <w:rPr>
+          <w:b/>
+          <w:bCs/>
+        </w:rPr>
+        <w:t xml:space="preserve">Changes in </w:t>
+      </w:r>
+      <w:r>
+        <w:rPr>
+          <w:b/>
+          <w:bCs/>
+        </w:rPr>
+        <w:t>Poverty Indicators by Region</w:t>
+      </w:r>
+      <w:r>
+        <w:rPr>
+          <w:b/>
+          <w:bCs/>
+        </w:rPr>
+        <w:t>: Middle East and North Africa</w:t>
+      </w:r>
+    </w:p>
+    <w:p>
+      <w:pPr>
+        <w:jc w:val="center"/>
+      </w:pPr>
+      <w:r>
+        <w:drawing>
+          <wp:inline distT="0" distB="0" distL="0" distR="0" wp14:anchorId="3B34E4FF" wp14:editId="4453D799">
+            <wp:extent cx="5770880" cy="1996379"/>
+            <wp:effectExtent l="0" t="0" r="1270" b="4445"/>
+            <wp:docPr id="1627666324" name="Picture 1" descr="A graph of a person and person&#10;&#10;AI-generated content may be incorrect."/>
+            <wp:cNvGraphicFramePr>
+              <a:graphicFrameLocks xmlns:a="http://schemas.openxmlformats.org/drawingml/2006/main" noChangeAspect="1"/>
+            </wp:cNvGraphicFramePr>
+            <a:graphic xmlns:a="http://schemas.openxmlformats.org/drawingml/2006/main">
+              <a:graphicData uri="http://schemas.openxmlformats.org/drawingml/2006/picture">
+                <pic:pic xmlns:pic="http://schemas.openxmlformats.org/drawingml/2006/picture">
+                  <pic:nvPicPr>
+                    <pic:cNvPr id="1627666324" name="Picture 1" descr="A graph of a person and person&#10;&#10;AI-generated content may be incorrect."/>
+                    <pic:cNvPicPr/>
+                  </pic:nvPicPr>
+                  <pic:blipFill>
+                    <a:blip r:embed="rId8"/>
+                    <a:stretch>
+                      <a:fillRect/>
+                    </a:stretch>
+                  </pic:blipFill>
+                  <pic:spPr>
+                    <a:xfrm>
+                      <a:off x="0" y="0"/>
+                      <a:ext cx="5775368" cy="1997931"/>
+                    </a:xfrm>
+                    <a:prstGeom prst="rect">
+                      <a:avLst/>
+                    </a:prstGeom>
+                  </pic:spPr>
+                </pic:pic>
+              </a:graphicData>
+            </a:graphic>
+          </wp:inline>
+        </w:drawing>
+      </w:r>
+    </w:p>
+    <w:p>
+      <w:pPr>
+        <w:jc w:val="center"/>
+      </w:pPr>
+      <w:r>
+        <w:rPr>
+          <w:i/>
+          <w:iCs/>
+        </w:rPr>
+        <w:t>Source: Poverty and Inequality Platform (September 2025, World Bank Group)</w:t>
+      </w:r>
+      <w:r>
+        <w:t xml:space="preserve"> </w:t>
+      </w:r>
+    </w:p>
+    <w:p>
+      <w:pPr>
+        <w:ind w:left="360"/>
+      </w:pPr>
+      <w:r>
+        <w:t xml:space="preserve">An opposite </w:t>
+      </w:r>
+      <w:r>
+        <w:t>trend</w:t>
+      </w:r>
+      <w:r>
+        <w:t xml:space="preserve"> was </w:t>
+      </w:r>
+      <w:r>
+        <w:t xml:space="preserve">observed </w:t>
+      </w:r>
+      <w:r>
+        <w:t xml:space="preserve">in </w:t>
+      </w:r>
+      <w:r>
+        <w:rPr>
+          <w:i/>
+          <w:iCs/>
+        </w:rPr>
+        <w:t>South Asia</w:t>
+      </w:r>
+      <w:r>
+        <w:t xml:space="preserve"> as Pakistan and Afghanistan left the region. Both poverty rate and millions of poor decreased with the new regional grouping. </w:t>
+      </w:r>
+    </w:p>
+    <w:p>
+      <w:pPr>
+        <w:jc w:val="center"/>
+        <w:rPr>
+          <w:b/>
+          <w:bCs/>
+        </w:rPr>
+      </w:pPr>
+      <w:r>
+        <w:rPr>
+          <w:b/>
+          <w:bCs/>
+        </w:rPr>
+        <w:t xml:space="preserve">Figure 3: Changes in Poverty Indicators by Region: South Asia </w:t>
+      </w:r>
+    </w:p>
+    <w:p>
+      <w:pPr>
+        <w:jc w:val="center"/>
+        <w:rPr>
+          <w:i/>
+          <w:iCs/>
+        </w:rPr>
+      </w:pPr>
+      <w:r>
+        <w:rPr>
+          <w:i/>
+          <w:iCs/>
+        </w:rPr>
+        <w:drawing>
+          <wp:inline distT="0" distB="0" distL="0" distR="0" wp14:anchorId="7D2336D5" wp14:editId="7B9FAACA">
+            <wp:extent cx="5603240" cy="1922821"/>
+            <wp:effectExtent l="0" t="0" r="0" b="1270"/>
+            <wp:docPr id="1102582805" name="Picture 1" descr="A graph of a person and person&#10;&#10;AI-generated content may be incorrect."/>
+            <wp:cNvGraphicFramePr>
+              <a:graphicFrameLocks xmlns:a="http://schemas.openxmlformats.org/drawingml/2006/main" noChangeAspect="1"/>
+            </wp:cNvGraphicFramePr>
+            <a:graphic xmlns:a="http://schemas.openxmlformats.org/drawingml/2006/main">
+              <a:graphicData uri="http://schemas.openxmlformats.org/drawingml/2006/picture">
+                <pic:pic xmlns:pic="http://schemas.openxmlformats.org/drawingml/2006/picture">
+                  <pic:nvPicPr>
+                    <pic:cNvPr id="1102582805" name="Picture 1" descr="A graph of a person and person&#10;&#10;AI-generated content may be incorrect."/>
+                    <pic:cNvPicPr/>
+                  </pic:nvPicPr>
+                  <pic:blipFill>
+                    <a:blip r:embed="rId9"/>
+                    <a:stretch>
+                      <a:fillRect/>
+                    </a:stretch>
+                  </pic:blipFill>
+                  <pic:spPr>
+                    <a:xfrm>
+                      <a:off x="0" y="0"/>
+                      <a:ext cx="5613387" cy="1926303"/>
+                    </a:xfrm>
+                    <a:prstGeom prst="rect">
+                      <a:avLst/>
+                    </a:prstGeom>
+                  </pic:spPr>
+                </pic:pic>
+              </a:graphicData>
+            </a:graphic>
+          </wp:inline>
+        </w:drawing>
+      </w:r>
+    </w:p>
+    <w:p>
+      <w:pPr>
+        <w:jc w:val="center"/>
+      </w:pPr>
+      <w:r>
+        <w:rPr>
+          <w:i/>
+          <w:iCs/>
+        </w:rPr>
+        <w:t>Source: Poverty and Inequality Platform (September 2025, World Bank Group)</w:t>
+      </w:r>
+      <w:r>
+        <w:t xml:space="preserve"> </w:t>
+      </w:r>
+    </w:p>
+    <w:p>
+      <w:pPr>
+        <w:ind w:left="360"/>
+      </w:pPr>
+      <w:r>
+        <w:rPr>
+          <w:b/>
+          <w:bCs/>
+        </w:rPr>
+        <w:t xml:space="preserve">Examine </w:t>
+      </w:r>
+      <w:r>
+        <w:rPr>
+          <w:b/>
+          <w:bCs/>
+        </w:rPr>
+        <w:t>Group Patterns with Side-by-Side Panels</w:t>
+      </w:r>
+    </w:p>
+    <w:p>
+      <w:pPr>
+        <w:ind w:left="360"/>
+      </w:pPr>
+      <w:r>
+        <w:t>The last tab allows users to visualize poverty rate trends in two different groupings at once. User</w:t>
+      </w:r>
+      <w:r>
+        <w:t>s</w:t>
+      </w:r>
+      <w:r>
+        <w:t xml:space="preserve"> can choose to visualize poverty rate trajectories with latest and historical definitions or with two completely different groups. </w:t>
+      </w:r>
+    </w:p>
+    <w:p>
+      <w:pPr>
+        <w:ind w:left="360"/>
+      </w:pPr>
+      <w:r>
+        <w:lastRenderedPageBreak/>
+        <w:t xml:space="preserve">For instance, </w:t>
+      </w:r>
+      <w:r>
+        <w:t xml:space="preserve">the </w:t>
+      </w:r>
+      <w:r>
+        <w:t>chart</w:t>
+      </w:r>
+      <w:r>
+        <w:t>s</w:t>
+      </w:r>
+      <w:r>
+        <w:t xml:space="preserve"> below </w:t>
+      </w:r>
+      <w:r>
+        <w:t>present</w:t>
+      </w:r>
+      <w:r>
+        <w:t xml:space="preserve"> aggregated poverty rate </w:t>
+      </w:r>
+      <w:r>
+        <w:t>by</w:t>
+      </w:r>
+      <w:r>
+        <w:t xml:space="preserve"> income groups and fragility status. These charts </w:t>
+      </w:r>
+      <w:r>
+        <w:t xml:space="preserve">show </w:t>
+      </w:r>
+      <w:r>
+        <w:t>that upper</w:t>
+      </w:r>
+      <w:r>
+        <w:t>-</w:t>
+      </w:r>
+      <w:r>
+        <w:t>middle</w:t>
+      </w:r>
+      <w:r>
+        <w:t>-</w:t>
+      </w:r>
+      <w:r>
+        <w:t xml:space="preserve">income </w:t>
+      </w:r>
+      <w:r>
+        <w:t xml:space="preserve">countries </w:t>
+      </w:r>
+      <w:r>
+        <w:t xml:space="preserve">and those </w:t>
+      </w:r>
+      <w:r>
+        <w:t xml:space="preserve">not classified as </w:t>
+      </w:r>
+      <w:r>
+        <w:t xml:space="preserve">FCV </w:t>
+      </w:r>
+      <w:r>
+        <w:t>state</w:t>
+      </w:r>
+      <w:r>
+        <w:t>s</w:t>
+      </w:r>
+      <w:r>
+        <w:t xml:space="preserve"> </w:t>
+      </w:r>
+      <w:r>
+        <w:t>experienced the highest level of reduction in extreme poverty rate</w:t>
+      </w:r>
+      <w:r>
+        <w:t xml:space="preserve">. </w:t>
+      </w:r>
+    </w:p>
+    <w:p>
+      <w:pPr>
+        <w:ind w:left="360"/>
+        <w:jc w:val="center"/>
+        <w:rPr>
+          <w:b/>
+          <w:bCs/>
+        </w:rPr>
+      </w:pPr>
+      <w:r>
+        <w:rPr>
+          <w:b/>
+          <w:bCs/>
+        </w:rPr>
+        <w:t>Figure 4. Poverty Rate Trajectory: Income Group vs. FCV</w:t>
+      </w:r>
+    </w:p>
+    <w:p>
+      <w:pPr>
+        <w:ind w:left="360"/>
+        <w:jc w:val="center"/>
+      </w:pPr>
+      <w:r>
+        <w:drawing>
+          <wp:inline distT="0" distB="0" distL="0" distR="0" wp14:anchorId="1CCA5E02" wp14:editId="4C7A9A6E">
+            <wp:extent cx="5781145" cy="1965960"/>
+            <wp:effectExtent l="0" t="0" r="0" b="0"/>
+            <wp:docPr id="1053415400" name="Picture 1" descr="A graph of different colored lines&#10;&#10;AI-generated content may be incorrect."/>
+            <wp:cNvGraphicFramePr>
+              <a:graphicFrameLocks xmlns:a="http://schemas.openxmlformats.org/drawingml/2006/main" noChangeAspect="1"/>
+            </wp:cNvGraphicFramePr>
+            <a:graphic xmlns:a="http://schemas.openxmlformats.org/drawingml/2006/main">
+              <a:graphicData uri="http://schemas.openxmlformats.org/drawingml/2006/picture">
+                <pic:pic xmlns:pic="http://schemas.openxmlformats.org/drawingml/2006/picture">
+                  <pic:nvPicPr>
+                    <pic:cNvPr id="1053415400" name="Picture 1" descr="A graph of different colored lines&#10;&#10;AI-generated content may be incorrect."/>
+                    <pic:cNvPicPr/>
+                  </pic:nvPicPr>
+                  <pic:blipFill>
+                    <a:blip r:embed="rId10"/>
+                    <a:stretch>
+                      <a:fillRect/>
+                    </a:stretch>
+                  </pic:blipFill>
+                  <pic:spPr>
+                    <a:xfrm>
+                      <a:off x="0" y="0"/>
+                      <a:ext cx="5785038" cy="1967284"/>
+                    </a:xfrm>
+                    <a:prstGeom prst="rect">
+                      <a:avLst/>
+                    </a:prstGeom>
+                  </pic:spPr>
+                </pic:pic>
+              </a:graphicData>
+            </a:graphic>
+          </wp:inline>
+        </w:drawing>
+      </w:r>
+    </w:p>
+    <w:p>
+      <w:pPr>
+        <w:jc w:val="center"/>
+      </w:pPr>
+      <w:r>
+        <w:rPr>
+          <w:i/>
+          <w:iCs/>
+        </w:rPr>
+        <w:t>Source: Poverty and Inequality Platform (September 2025, World Bank Group)</w:t>
+      </w:r>
+      <w:r>
+        <w:t xml:space="preserve"> </w:t>
+      </w:r>
+    </w:p>
+    <w:p>
+      <w:pPr>
+        <w:ind w:left="360"/>
+      </w:pPr>
+      <w:r>
+        <w:t xml:space="preserve">The </w:t>
+      </w:r>
+      <w:r>
+        <w:rPr>
+          <w:i/>
+          <w:iCs/>
+        </w:rPr>
+        <w:t>PIP Poverty Aggregate Dashboard</w:t>
+      </w:r>
+      <w:r>
+        <w:t xml:space="preserve"> </w:t>
+      </w:r>
+      <w:r>
+        <w:t>(</w:t>
+      </w:r>
+      <w:r>
+        <w:rPr>
+          <w:highlight w:val="yellow"/>
+        </w:rPr>
+        <w:t>Add Link</w:t>
+      </w:r>
+      <w:r>
+        <w:t xml:space="preserve">) </w:t>
+      </w:r>
+      <w:r>
+        <w:t xml:space="preserve">provides an interactive visualization of aggregate poverty indicators across four groupings used frequently in policy analysis and academic reports: Region; Income; FCV; and IDA status. This dashboard allows users to compare poverty indicators within selected groups, overlay two trends from any grouping, and examine patterns </w:t>
+      </w:r>
+      <w:r>
+        <w:t>using</w:t>
+      </w:r>
+      <w:r>
+        <w:t xml:space="preserve"> side-by-side panel. </w:t>
+      </w:r>
+    </w:p>
+    <w:p>
+      <w:pPr>
+        <w:ind w:left="360"/>
+      </w:pPr>
+      <w:r>
+        <w:t xml:space="preserve">More information on its visualizations and the definitions of important indicators can be found in the “About” page of the dashboard. The </w:t>
+      </w:r>
+      <w:hyperlink r:id="rId11" w:history="1">
+        <w:r>
+          <w:rPr>
+            <w:rStyle w:val="Hyperlink"/>
+          </w:rPr>
+          <w:t>PIP Methodological Handbook</w:t>
+        </w:r>
+      </w:hyperlink>
+      <w:r>
+        <w:t xml:space="preserve"> contains additional technical details on the indicators. </w:t>
+      </w:r>
+    </w:p>
+    <w:p>
+      <w:pPr>
+        <w:ind w:left="360"/>
+      </w:pPr>
+      <w:r>
+        <w:t xml:space="preserve">We would like to invite all potential users to explore the dashboard and engage in important discussions on aggregate poverty. </w:t>
+      </w:r>
+      <w:r>
+        <w:t xml:space="preserve">If you have suggestions or notice anything missing, we encourage you to help us improve by contacting us at </w:t>
+      </w:r>
+      <w:hyperlink r:id="rId12" w:history="1">
+        <w:r>
+          <w:rPr>
+            <w:rStyle w:val="Hyperlink"/>
+          </w:rPr>
+          <w:t>pip@worldbank.org</w:t>
+        </w:r>
+      </w:hyperlink>
+      <w:r>
+        <w:t xml:space="preserve">. </w:t>
+      </w:r>
+    </w:p>
     <w:sectPr>
-      <w:footerReference w:type="even" r:id="rId6"/>
-      <w:footerReference w:type="default" r:id="rId7"/>
-      <w:footerReference w:type="first" r:id="rId8"/>
+      <w:footerReference w:type="even" r:id="rId13"/>
+      <w:footerReference w:type="default" r:id="rId14"/>
+      <w:footerReference w:type="first" r:id="rId15"/>
       <w:pgSz w:w="12240" w:h="15840"/>
       <w:pgMar w:top="1440" w:right="1440" w:bottom="1440" w:left="1440" w:header="720" w:footer="720" w:gutter="0"/>
       <w:cols w:space="720"/>
@@ -135,7 +1338,6 @@
               <v:path gradientshapeok="t" o:connecttype="rect"/>
             </v:shapetype>
             <v:shape id="Text Box 2" o:spid="_x0000_s1026" type="#_x0000_t202" alt="Official Use Only" style="position:absolute;margin-left:35.65pt;margin-top:0;width:86.85pt;height:29.15pt;z-index:251659264;visibility:visible;mso-wrap-style:none;mso-wrap-distance-left:0;mso-wrap-distance-top:0;mso-wrap-distance-right:0;mso-wrap-distance-bottom:0;mso-position-horizontal:right;mso-position-horizontal-relative:page;mso-position-vertical:bottom;mso-position-vertical-relative:page;v-text-anchor:bottom" o:gfxdata="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" filled="f" stroked="f">
-              <v:fill o:detectmouseclick="t"/>
               <v:textbox style="mso-fit-shape-to-text:t" inset="0,0,20pt,15pt">
                 <w:txbxContent>
                   <w:p>
@@ -266,7 +1468,6 @@
               <v:path gradientshapeok="t" o:connecttype="rect"/>
             </v:shapetype>
             <v:shape id="Text Box 3" o:spid="_x0000_s1027" type="#_x0000_t202" alt="Official Use Only" style="position:absolute;margin-left:35.65pt;margin-top:0;width:86.85pt;height:29.15pt;z-index:251660288;visibility:visible;mso-wrap-style:none;mso-wrap-distance-left:0;mso-wrap-distance-top:0;mso-wrap-distance-right:0;mso-wrap-distance-bottom:0;mso-position-horizontal:right;mso-position-horizontal-relative:page;mso-position-vertical:bottom;mso-position-vertical-relative:page;v-text-anchor:bottom" o:gfxdata="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" filled="f" stroked="f">
-              <v:fill o:detectmouseclick="t"/>
               <v:textbox style="mso-fit-shape-to-text:t" inset="0,0,20pt,15pt">
                 <w:txbxContent>
                   <w:p>
@@ -397,7 +1598,6 @@
               <v:path gradientshapeok="t" o:connecttype="rect"/>
             </v:shapetype>
             <v:shape id="Text Box 1" o:spid="_x0000_s1028" type="#_x0000_t202" alt="Official Use Only" style="position:absolute;margin-left:35.65pt;margin-top:0;width:86.85pt;height:29.15pt;z-index:251658240;visibility:visible;mso-wrap-style:none;mso-wrap-distance-left:0;mso-wrap-distance-top:0;mso-wrap-distance-right:0;mso-wrap-distance-bottom:0;mso-position-horizontal:right;mso-position-horizontal-relative:page;mso-position-vertical:bottom;mso-position-vertical-relative:page;v-text-anchor:bottom" o:gfxdata="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" filled="f" stroked="f">
-              <v:fill o:detectmouseclick="t"/>
               <v:textbox style="mso-fit-shape-to-text:t" inset="0,0,20pt,15pt">
                 <w:txbxContent>
                   <w:p>
@@ -457,6 +1657,659 @@
     </w:p>
   </w:footnote>
 </w:footnotes>
+</file>
+
+<file path=word/numbering.xml><?xml version="1.0" encoding="utf-8"?>
+<w:numbering xmlns:wpc="http://schemas.microsoft.com/office/word/2010/wordprocessingCanvas" xmlns:cx="http://schemas.microsoft.com/office/drawing/2014/chartex" xmlns:cx1="http://schemas.microsoft.com/office/drawing/2015/9/8/chartex" xmlns:cx2="http://schemas.microsoft.com/office/drawing/2015/10/21/chartex" xmlns:cx3="http://schemas.microsoft.com/office/drawing/2016/5/9/chartex" xmlns:cx4="http://schemas.microsoft.com/office/drawing/2016/5/10/chartex" xmlns:cx5="http://schemas.microsoft.com/office/drawing/2016/5/11/chartex" xmlns:cx6="http://schemas.microsoft.com/office/drawing/2016/5/12/chartex" xmlns:cx7="http://schemas.microsoft.com/office/drawing/2016/5/13/chartex" xmlns:cx8="http://schemas.microsoft.com/office/drawing/2016/5/14/chartex" xmlns:mc="http://schemas.openxmlformats.org/markup-compatibility/2006" xmlns:aink="http://schemas.microsoft.com/office/drawing/2016/ink" xmlns:am3d="http://schemas.microsoft.com/office/drawing/2017/model3d" xmlns:o="urn:schemas-microsoft-com:office:office" xmlns:oel="http://schemas.microsoft.com/office/2019/extlst" xmlns:r="http://schemas.openxmlformats.org/officeDocument/2006/relationships" xmlns:m="http://schemas.openxmlformats.org/officeDocument/2006/math" xmlns:v="urn:schemas-microsoft-com:vml" xmlns:wp14="http://schemas.microsoft.com/office/word/2010/wordprocessingDrawing" xmlns:wp="http://schemas.openxmlformats.org/drawingml/2006/wordprocessingDrawing" xmlns:w10="urn:schemas-microsoft-com:office:word" xmlns:w="http://schemas.openxmlformats.org/wordprocessingml/2006/main" xmlns:w14="http://schemas.microsoft.com/office/word/2010/wordml" xmlns:w15="http://schemas.microsoft.com/office/word/2012/wordml" xmlns:w16cex="http://schemas.microsoft.com/office/word/2018/wordml/cex" xmlns:w16cid="http://schemas.microsoft.com/office/word/2016/wordml/cid" xmlns:w16="http://schemas.microsoft.com/office/word/2018/wordml" xmlns:w16du="http://schemas.microsoft.com/office/word/2023/wordml/word16du" xmlns:w16sdtdh="http://schemas.microsoft.com/office/word/2020/wordml/sdtdatahash" xmlns:w16sdtfl="http://schemas.microsoft.com/office/word/2024/wordml/sdtformatlock" xmlns:w16se="http://schemas.microsoft.com/office/word/2015/wordml/symex" xmlns:wpg="http://schemas.microsoft.com/office/word/2010/wordprocessingGroup" xmlns:wpi="http://schemas.microsoft.com/office/word/2010/wordprocessingInk" xmlns:wne="http://schemas.microsoft.com/office/word/2006/wordml" xmlns:wps="http://schemas.microsoft.com/office/word/2010/wordprocessingShape" mc:Ignorable="w14 w15 w16se w16cid w16 w16cex w16sdtdh w16sdtfl w16du wp14">
+  <w:abstractNum w:abstractNumId="0" w15:restartNumberingAfterBreak="0">
+    <w:nsid w:val="02202571"/>
+    <w:multiLevelType w:val="hybridMultilevel"/>
+    <w:tmpl w:val="4D16D6E8"/>
+    <w:lvl w:ilvl="0" w:tplc="04090001">
+      <w:start w:val="1"/>
+      <w:numFmt w:val="bullet"/>
+      <w:lvlText w:val=""/>
+      <w:lvlJc w:val="left"/>
+      <w:pPr>
+        <w:ind w:left="1440" w:hanging="360"/>
+      </w:pPr>
+      <w:rPr>
+        <w:rFonts w:ascii="Symbol" w:hAnsi="Symbol" w:hint="default"/>
+      </w:rPr>
+    </w:lvl>
+    <w:lvl w:ilvl="1" w:tplc="04090003" w:tentative="1">
+      <w:start w:val="1"/>
+      <w:numFmt w:val="bullet"/>
+      <w:lvlText w:val="o"/>
+      <w:lvlJc w:val="left"/>
+      <w:pPr>
+        <w:ind w:left="2160" w:hanging="360"/>
+      </w:pPr>
+      <w:rPr>
+        <w:rFonts w:ascii="Courier New" w:hAnsi="Courier New" w:cs="Courier New" w:hint="default"/>
+      </w:rPr>
+    </w:lvl>
+    <w:lvl w:ilvl="2" w:tplc="04090005" w:tentative="1">
+      <w:start w:val="1"/>
+      <w:numFmt w:val="bullet"/>
+      <w:lvlText w:val=""/>
+      <w:lvlJc w:val="left"/>
+      <w:pPr>
+        <w:ind w:left="2880" w:hanging="360"/>
+      </w:pPr>
+      <w:rPr>
+        <w:rFonts w:ascii="Wingdings" w:hAnsi="Wingdings" w:hint="default"/>
+      </w:rPr>
+    </w:lvl>
+    <w:lvl w:ilvl="3" w:tplc="04090001" w:tentative="1">
+      <w:start w:val="1"/>
+      <w:numFmt w:val="bullet"/>
+      <w:lvlText w:val=""/>
+      <w:lvlJc w:val="left"/>
+      <w:pPr>
+        <w:ind w:left="3600" w:hanging="360"/>
+      </w:pPr>
+      <w:rPr>
+        <w:rFonts w:ascii="Symbol" w:hAnsi="Symbol" w:hint="default"/>
+      </w:rPr>
+    </w:lvl>
+    <w:lvl w:ilvl="4" w:tplc="04090003" w:tentative="1">
+      <w:start w:val="1"/>
+      <w:numFmt w:val="bullet"/>
+      <w:lvlText w:val="o"/>
+      <w:lvlJc w:val="left"/>
+      <w:pPr>
+        <w:ind w:left="4320" w:hanging="360"/>
+      </w:pPr>
+      <w:rPr>
+        <w:rFonts w:ascii="Courier New" w:hAnsi="Courier New" w:cs="Courier New" w:hint="default"/>
+      </w:rPr>
+    </w:lvl>
+    <w:lvl w:ilvl="5" w:tplc="04090005" w:tentative="1">
+      <w:start w:val="1"/>
+      <w:numFmt w:val="bullet"/>
+      <w:lvlText w:val=""/>
+      <w:lvlJc w:val="left"/>
+      <w:pPr>
+        <w:ind w:left="5040" w:hanging="360"/>
+      </w:pPr>
+      <w:rPr>
+        <w:rFonts w:ascii="Wingdings" w:hAnsi="Wingdings" w:hint="default"/>
+      </w:rPr>
+    </w:lvl>
+    <w:lvl w:ilvl="6" w:tplc="04090001" w:tentative="1">
+      <w:start w:val="1"/>
+      <w:numFmt w:val="bullet"/>
+      <w:lvlText w:val=""/>
+      <w:lvlJc w:val="left"/>
+      <w:pPr>
+        <w:ind w:left="5760" w:hanging="360"/>
+      </w:pPr>
+      <w:rPr>
+        <w:rFonts w:ascii="Symbol" w:hAnsi="Symbol" w:hint="default"/>
+      </w:rPr>
+    </w:lvl>
+    <w:lvl w:ilvl="7" w:tplc="04090003" w:tentative="1">
+      <w:start w:val="1"/>
+      <w:numFmt w:val="bullet"/>
+      <w:lvlText w:val="o"/>
+      <w:lvlJc w:val="left"/>
+      <w:pPr>
+        <w:ind w:left="6480" w:hanging="360"/>
+      </w:pPr>
+      <w:rPr>
+        <w:rFonts w:ascii="Courier New" w:hAnsi="Courier New" w:cs="Courier New" w:hint="default"/>
+      </w:rPr>
+    </w:lvl>
+    <w:lvl w:ilvl="8" w:tplc="04090005" w:tentative="1">
+      <w:start w:val="1"/>
+      <w:numFmt w:val="bullet"/>
+      <w:lvlText w:val=""/>
+      <w:lvlJc w:val="left"/>
+      <w:pPr>
+        <w:ind w:left="7200" w:hanging="360"/>
+      </w:pPr>
+      <w:rPr>
+        <w:rFonts w:ascii="Wingdings" w:hAnsi="Wingdings" w:hint="default"/>
+      </w:rPr>
+    </w:lvl>
+  </w:abstractNum>
+  <w:abstractNum w:abstractNumId="1" w15:restartNumberingAfterBreak="0">
+    <w:nsid w:val="2B07658A"/>
+    <w:multiLevelType w:val="hybridMultilevel"/>
+    <w:tmpl w:val="42589C6E"/>
+    <w:lvl w:ilvl="0" w:tplc="0409000F">
+      <w:start w:val="1"/>
+      <w:numFmt w:val="decimal"/>
+      <w:lvlText w:val="%1."/>
+      <w:lvlJc w:val="left"/>
+      <w:pPr>
+        <w:ind w:left="720" w:hanging="360"/>
+      </w:pPr>
+      <w:rPr>
+        <w:rFonts w:hint="default"/>
+      </w:rPr>
+    </w:lvl>
+    <w:lvl w:ilvl="1" w:tplc="04090019" w:tentative="1">
+      <w:start w:val="1"/>
+      <w:numFmt w:val="lowerLetter"/>
+      <w:lvlText w:val="%2."/>
+      <w:lvlJc w:val="left"/>
+      <w:pPr>
+        <w:ind w:left="1440" w:hanging="360"/>
+      </w:pPr>
+    </w:lvl>
+    <w:lvl w:ilvl="2" w:tplc="0409001B" w:tentative="1">
+      <w:start w:val="1"/>
+      <w:numFmt w:val="lowerRoman"/>
+      <w:lvlText w:val="%3."/>
+      <w:lvlJc w:val="right"/>
+      <w:pPr>
+        <w:ind w:left="2160" w:hanging="180"/>
+      </w:pPr>
+    </w:lvl>
+    <w:lvl w:ilvl="3" w:tplc="0409000F" w:tentative="1">
+      <w:start w:val="1"/>
+      <w:numFmt w:val="decimal"/>
+      <w:lvlText w:val="%4."/>
+      <w:lvlJc w:val="left"/>
+      <w:pPr>
+        <w:ind w:left="2880" w:hanging="360"/>
+      </w:pPr>
+    </w:lvl>
+    <w:lvl w:ilvl="4" w:tplc="04090019" w:tentative="1">
+      <w:start w:val="1"/>
+      <w:numFmt w:val="lowerLetter"/>
+      <w:lvlText w:val="%5."/>
+      <w:lvlJc w:val="left"/>
+      <w:pPr>
+        <w:ind w:left="3600" w:hanging="360"/>
+      </w:pPr>
+    </w:lvl>
+    <w:lvl w:ilvl="5" w:tplc="0409001B" w:tentative="1">
+      <w:start w:val="1"/>
+      <w:numFmt w:val="lowerRoman"/>
+      <w:lvlText w:val="%6."/>
+      <w:lvlJc w:val="right"/>
+      <w:pPr>
+        <w:ind w:left="4320" w:hanging="180"/>
+      </w:pPr>
+    </w:lvl>
+    <w:lvl w:ilvl="6" w:tplc="0409000F" w:tentative="1">
+      <w:start w:val="1"/>
+      <w:numFmt w:val="decimal"/>
+      <w:lvlText w:val="%7."/>
+      <w:lvlJc w:val="left"/>
+      <w:pPr>
+        <w:ind w:left="5040" w:hanging="360"/>
+      </w:pPr>
+    </w:lvl>
+    <w:lvl w:ilvl="7" w:tplc="04090019" w:tentative="1">
+      <w:start w:val="1"/>
+      <w:numFmt w:val="lowerLetter"/>
+      <w:lvlText w:val="%8."/>
+      <w:lvlJc w:val="left"/>
+      <w:pPr>
+        <w:ind w:left="5760" w:hanging="360"/>
+      </w:pPr>
+    </w:lvl>
+    <w:lvl w:ilvl="8" w:tplc="0409001B" w:tentative="1">
+      <w:start w:val="1"/>
+      <w:numFmt w:val="lowerRoman"/>
+      <w:lvlText w:val="%9."/>
+      <w:lvlJc w:val="right"/>
+      <w:pPr>
+        <w:ind w:left="6480" w:hanging="180"/>
+      </w:pPr>
+    </w:lvl>
+  </w:abstractNum>
+  <w:abstractNum w:abstractNumId="2" w15:restartNumberingAfterBreak="0">
+    <w:nsid w:val="32BB68AC"/>
+    <w:multiLevelType w:val="hybridMultilevel"/>
+    <w:tmpl w:val="9E743610"/>
+    <w:lvl w:ilvl="0" w:tplc="04090001">
+      <w:start w:val="1"/>
+      <w:numFmt w:val="bullet"/>
+      <w:lvlText w:val=""/>
+      <w:lvlJc w:val="left"/>
+      <w:pPr>
+        <w:ind w:left="1440" w:hanging="360"/>
+      </w:pPr>
+      <w:rPr>
+        <w:rFonts w:ascii="Symbol" w:hAnsi="Symbol" w:hint="default"/>
+      </w:rPr>
+    </w:lvl>
+    <w:lvl w:ilvl="1" w:tplc="04090003" w:tentative="1">
+      <w:start w:val="1"/>
+      <w:numFmt w:val="bullet"/>
+      <w:lvlText w:val="o"/>
+      <w:lvlJc w:val="left"/>
+      <w:pPr>
+        <w:ind w:left="2160" w:hanging="360"/>
+      </w:pPr>
+      <w:rPr>
+        <w:rFonts w:ascii="Courier New" w:hAnsi="Courier New" w:cs="Courier New" w:hint="default"/>
+      </w:rPr>
+    </w:lvl>
+    <w:lvl w:ilvl="2" w:tplc="04090005" w:tentative="1">
+      <w:start w:val="1"/>
+      <w:numFmt w:val="bullet"/>
+      <w:lvlText w:val=""/>
+      <w:lvlJc w:val="left"/>
+      <w:pPr>
+        <w:ind w:left="2880" w:hanging="360"/>
+      </w:pPr>
+      <w:rPr>
+        <w:rFonts w:ascii="Wingdings" w:hAnsi="Wingdings" w:hint="default"/>
+      </w:rPr>
+    </w:lvl>
+    <w:lvl w:ilvl="3" w:tplc="04090001" w:tentative="1">
+      <w:start w:val="1"/>
+      <w:numFmt w:val="bullet"/>
+      <w:lvlText w:val=""/>
+      <w:lvlJc w:val="left"/>
+      <w:pPr>
+        <w:ind w:left="3600" w:hanging="360"/>
+      </w:pPr>
+      <w:rPr>
+        <w:rFonts w:ascii="Symbol" w:hAnsi="Symbol" w:hint="default"/>
+      </w:rPr>
+    </w:lvl>
+    <w:lvl w:ilvl="4" w:tplc="04090003" w:tentative="1">
+      <w:start w:val="1"/>
+      <w:numFmt w:val="bullet"/>
+      <w:lvlText w:val="o"/>
+      <w:lvlJc w:val="left"/>
+      <w:pPr>
+        <w:ind w:left="4320" w:hanging="360"/>
+      </w:pPr>
+      <w:rPr>
+        <w:rFonts w:ascii="Courier New" w:hAnsi="Courier New" w:cs="Courier New" w:hint="default"/>
+      </w:rPr>
+    </w:lvl>
+    <w:lvl w:ilvl="5" w:tplc="04090005" w:tentative="1">
+      <w:start w:val="1"/>
+      <w:numFmt w:val="bullet"/>
+      <w:lvlText w:val=""/>
+      <w:lvlJc w:val="left"/>
+      <w:pPr>
+        <w:ind w:left="5040" w:hanging="360"/>
+      </w:pPr>
+      <w:rPr>
+        <w:rFonts w:ascii="Wingdings" w:hAnsi="Wingdings" w:hint="default"/>
+      </w:rPr>
+    </w:lvl>
+    <w:lvl w:ilvl="6" w:tplc="04090001" w:tentative="1">
+      <w:start w:val="1"/>
+      <w:numFmt w:val="bullet"/>
+      <w:lvlText w:val=""/>
+      <w:lvlJc w:val="left"/>
+      <w:pPr>
+        <w:ind w:left="5760" w:hanging="360"/>
+      </w:pPr>
+      <w:rPr>
+        <w:rFonts w:ascii="Symbol" w:hAnsi="Symbol" w:hint="default"/>
+      </w:rPr>
+    </w:lvl>
+    <w:lvl w:ilvl="7" w:tplc="04090003" w:tentative="1">
+      <w:start w:val="1"/>
+      <w:numFmt w:val="bullet"/>
+      <w:lvlText w:val="o"/>
+      <w:lvlJc w:val="left"/>
+      <w:pPr>
+        <w:ind w:left="6480" w:hanging="360"/>
+      </w:pPr>
+      <w:rPr>
+        <w:rFonts w:ascii="Courier New" w:hAnsi="Courier New" w:cs="Courier New" w:hint="default"/>
+      </w:rPr>
+    </w:lvl>
+    <w:lvl w:ilvl="8" w:tplc="04090005" w:tentative="1">
+      <w:start w:val="1"/>
+      <w:numFmt w:val="bullet"/>
+      <w:lvlText w:val=""/>
+      <w:lvlJc w:val="left"/>
+      <w:pPr>
+        <w:ind w:left="7200" w:hanging="360"/>
+      </w:pPr>
+      <w:rPr>
+        <w:rFonts w:ascii="Wingdings" w:hAnsi="Wingdings" w:hint="default"/>
+      </w:rPr>
+    </w:lvl>
+  </w:abstractNum>
+  <w:abstractNum w:abstractNumId="3" w15:restartNumberingAfterBreak="0">
+    <w:nsid w:val="4B8D3304"/>
+    <w:multiLevelType w:val="hybridMultilevel"/>
+    <w:tmpl w:val="BB706A16"/>
+    <w:lvl w:ilvl="0" w:tplc="04090001">
+      <w:start w:val="1"/>
+      <w:numFmt w:val="bullet"/>
+      <w:lvlText w:val=""/>
+      <w:lvlJc w:val="left"/>
+      <w:pPr>
+        <w:ind w:left="1440" w:hanging="360"/>
+      </w:pPr>
+      <w:rPr>
+        <w:rFonts w:ascii="Symbol" w:hAnsi="Symbol" w:hint="default"/>
+      </w:rPr>
+    </w:lvl>
+    <w:lvl w:ilvl="1" w:tplc="04090003" w:tentative="1">
+      <w:start w:val="1"/>
+      <w:numFmt w:val="bullet"/>
+      <w:lvlText w:val="o"/>
+      <w:lvlJc w:val="left"/>
+      <w:pPr>
+        <w:ind w:left="2160" w:hanging="360"/>
+      </w:pPr>
+      <w:rPr>
+        <w:rFonts w:ascii="Courier New" w:hAnsi="Courier New" w:cs="Courier New" w:hint="default"/>
+      </w:rPr>
+    </w:lvl>
+    <w:lvl w:ilvl="2" w:tplc="04090005" w:tentative="1">
+      <w:start w:val="1"/>
+      <w:numFmt w:val="bullet"/>
+      <w:lvlText w:val=""/>
+      <w:lvlJc w:val="left"/>
+      <w:pPr>
+        <w:ind w:left="2880" w:hanging="360"/>
+      </w:pPr>
+      <w:rPr>
+        <w:rFonts w:ascii="Wingdings" w:hAnsi="Wingdings" w:hint="default"/>
+      </w:rPr>
+    </w:lvl>
+    <w:lvl w:ilvl="3" w:tplc="04090001" w:tentative="1">
+      <w:start w:val="1"/>
+      <w:numFmt w:val="bullet"/>
+      <w:lvlText w:val=""/>
+      <w:lvlJc w:val="left"/>
+      <w:pPr>
+        <w:ind w:left="3600" w:hanging="360"/>
+      </w:pPr>
+      <w:rPr>
+        <w:rFonts w:ascii="Symbol" w:hAnsi="Symbol" w:hint="default"/>
+      </w:rPr>
+    </w:lvl>
+    <w:lvl w:ilvl="4" w:tplc="04090003" w:tentative="1">
+      <w:start w:val="1"/>
+      <w:numFmt w:val="bullet"/>
+      <w:lvlText w:val="o"/>
+      <w:lvlJc w:val="left"/>
+      <w:pPr>
+        <w:ind w:left="4320" w:hanging="360"/>
+      </w:pPr>
+      <w:rPr>
+        <w:rFonts w:ascii="Courier New" w:hAnsi="Courier New" w:cs="Courier New" w:hint="default"/>
+      </w:rPr>
+    </w:lvl>
+    <w:lvl w:ilvl="5" w:tplc="04090005" w:tentative="1">
+      <w:start w:val="1"/>
+      <w:numFmt w:val="bullet"/>
+      <w:lvlText w:val=""/>
+      <w:lvlJc w:val="left"/>
+      <w:pPr>
+        <w:ind w:left="5040" w:hanging="360"/>
+      </w:pPr>
+      <w:rPr>
+        <w:rFonts w:ascii="Wingdings" w:hAnsi="Wingdings" w:hint="default"/>
+      </w:rPr>
+    </w:lvl>
+    <w:lvl w:ilvl="6" w:tplc="04090001" w:tentative="1">
+      <w:start w:val="1"/>
+      <w:numFmt w:val="bullet"/>
+      <w:lvlText w:val=""/>
+      <w:lvlJc w:val="left"/>
+      <w:pPr>
+        <w:ind w:left="5760" w:hanging="360"/>
+      </w:pPr>
+      <w:rPr>
+        <w:rFonts w:ascii="Symbol" w:hAnsi="Symbol" w:hint="default"/>
+      </w:rPr>
+    </w:lvl>
+    <w:lvl w:ilvl="7" w:tplc="04090003" w:tentative="1">
+      <w:start w:val="1"/>
+      <w:numFmt w:val="bullet"/>
+      <w:lvlText w:val="o"/>
+      <w:lvlJc w:val="left"/>
+      <w:pPr>
+        <w:ind w:left="6480" w:hanging="360"/>
+      </w:pPr>
+      <w:rPr>
+        <w:rFonts w:ascii="Courier New" w:hAnsi="Courier New" w:cs="Courier New" w:hint="default"/>
+      </w:rPr>
+    </w:lvl>
+    <w:lvl w:ilvl="8" w:tplc="04090005" w:tentative="1">
+      <w:start w:val="1"/>
+      <w:numFmt w:val="bullet"/>
+      <w:lvlText w:val=""/>
+      <w:lvlJc w:val="left"/>
+      <w:pPr>
+        <w:ind w:left="7200" w:hanging="360"/>
+      </w:pPr>
+      <w:rPr>
+        <w:rFonts w:ascii="Wingdings" w:hAnsi="Wingdings" w:hint="default"/>
+      </w:rPr>
+    </w:lvl>
+  </w:abstractNum>
+  <w:abstractNum w:abstractNumId="4" w15:restartNumberingAfterBreak="0">
+    <w:nsid w:val="545C1D8F"/>
+    <w:multiLevelType w:val="hybridMultilevel"/>
+    <w:tmpl w:val="5E183044"/>
+    <w:lvl w:ilvl="0" w:tplc="0409000F">
+      <w:start w:val="1"/>
+      <w:numFmt w:val="decimal"/>
+      <w:lvlText w:val="%1."/>
+      <w:lvlJc w:val="left"/>
+      <w:pPr>
+        <w:ind w:left="720" w:hanging="360"/>
+      </w:pPr>
+      <w:rPr>
+        <w:rFonts w:hint="default"/>
+      </w:rPr>
+    </w:lvl>
+    <w:lvl w:ilvl="1" w:tplc="04090019" w:tentative="1">
+      <w:start w:val="1"/>
+      <w:numFmt w:val="lowerLetter"/>
+      <w:lvlText w:val="%2."/>
+      <w:lvlJc w:val="left"/>
+      <w:pPr>
+        <w:ind w:left="1440" w:hanging="360"/>
+      </w:pPr>
+    </w:lvl>
+    <w:lvl w:ilvl="2" w:tplc="0409001B" w:tentative="1">
+      <w:start w:val="1"/>
+      <w:numFmt w:val="lowerRoman"/>
+      <w:lvlText w:val="%3."/>
+      <w:lvlJc w:val="right"/>
+      <w:pPr>
+        <w:ind w:left="2160" w:hanging="180"/>
+      </w:pPr>
+    </w:lvl>
+    <w:lvl w:ilvl="3" w:tplc="0409000F" w:tentative="1">
+      <w:start w:val="1"/>
+      <w:numFmt w:val="decimal"/>
+      <w:lvlText w:val="%4."/>
+      <w:lvlJc w:val="left"/>
+      <w:pPr>
+        <w:ind w:left="2880" w:hanging="360"/>
+      </w:pPr>
+    </w:lvl>
+    <w:lvl w:ilvl="4" w:tplc="04090019" w:tentative="1">
+      <w:start w:val="1"/>
+      <w:numFmt w:val="lowerLetter"/>
+      <w:lvlText w:val="%5."/>
+      <w:lvlJc w:val="left"/>
+      <w:pPr>
+        <w:ind w:left="3600" w:hanging="360"/>
+      </w:pPr>
+    </w:lvl>
+    <w:lvl w:ilvl="5" w:tplc="0409001B" w:tentative="1">
+      <w:start w:val="1"/>
+      <w:numFmt w:val="lowerRoman"/>
+      <w:lvlText w:val="%6."/>
+      <w:lvlJc w:val="right"/>
+      <w:pPr>
+        <w:ind w:left="4320" w:hanging="180"/>
+      </w:pPr>
+    </w:lvl>
+    <w:lvl w:ilvl="6" w:tplc="0409000F" w:tentative="1">
+      <w:start w:val="1"/>
+      <w:numFmt w:val="decimal"/>
+      <w:lvlText w:val="%7."/>
+      <w:lvlJc w:val="left"/>
+      <w:pPr>
+        <w:ind w:left="5040" w:hanging="360"/>
+      </w:pPr>
+    </w:lvl>
+    <w:lvl w:ilvl="7" w:tplc="04090019" w:tentative="1">
+      <w:start w:val="1"/>
+      <w:numFmt w:val="lowerLetter"/>
+      <w:lvlText w:val="%8."/>
+      <w:lvlJc w:val="left"/>
+      <w:pPr>
+        <w:ind w:left="5760" w:hanging="360"/>
+      </w:pPr>
+    </w:lvl>
+    <w:lvl w:ilvl="8" w:tplc="0409001B" w:tentative="1">
+      <w:start w:val="1"/>
+      <w:numFmt w:val="lowerRoman"/>
+      <w:lvlText w:val="%9."/>
+      <w:lvlJc w:val="right"/>
+      <w:pPr>
+        <w:ind w:left="6480" w:hanging="180"/>
+      </w:pPr>
+    </w:lvl>
+  </w:abstractNum>
+  <w:abstractNum w:abstractNumId="5" w15:restartNumberingAfterBreak="0">
+    <w:nsid w:val="64445E02"/>
+    <w:multiLevelType w:val="hybridMultilevel"/>
+    <w:tmpl w:val="495E2950"/>
+    <w:lvl w:ilvl="0" w:tplc="04090001">
+      <w:start w:val="1"/>
+      <w:numFmt w:val="bullet"/>
+      <w:lvlText w:val=""/>
+      <w:lvlJc w:val="left"/>
+      <w:pPr>
+        <w:ind w:left="1440" w:hanging="360"/>
+      </w:pPr>
+      <w:rPr>
+        <w:rFonts w:ascii="Symbol" w:hAnsi="Symbol" w:hint="default"/>
+      </w:rPr>
+    </w:lvl>
+    <w:lvl w:ilvl="1" w:tplc="04090003" w:tentative="1">
+      <w:start w:val="1"/>
+      <w:numFmt w:val="bullet"/>
+      <w:lvlText w:val="o"/>
+      <w:lvlJc w:val="left"/>
+      <w:pPr>
+        <w:ind w:left="2160" w:hanging="360"/>
+      </w:pPr>
+      <w:rPr>
+        <w:rFonts w:ascii="Courier New" w:hAnsi="Courier New" w:cs="Courier New" w:hint="default"/>
+      </w:rPr>
+    </w:lvl>
+    <w:lvl w:ilvl="2" w:tplc="04090005" w:tentative="1">
+      <w:start w:val="1"/>
+      <w:numFmt w:val="bullet"/>
+      <w:lvlText w:val=""/>
+      <w:lvlJc w:val="left"/>
+      <w:pPr>
+        <w:ind w:left="2880" w:hanging="360"/>
+      </w:pPr>
+      <w:rPr>
+        <w:rFonts w:ascii="Wingdings" w:hAnsi="Wingdings" w:hint="default"/>
+      </w:rPr>
+    </w:lvl>
+    <w:lvl w:ilvl="3" w:tplc="04090001" w:tentative="1">
+      <w:start w:val="1"/>
+      <w:numFmt w:val="bullet"/>
+      <w:lvlText w:val=""/>
+      <w:lvlJc w:val="left"/>
+      <w:pPr>
+        <w:ind w:left="3600" w:hanging="360"/>
+      </w:pPr>
+      <w:rPr>
+        <w:rFonts w:ascii="Symbol" w:hAnsi="Symbol" w:hint="default"/>
+      </w:rPr>
+    </w:lvl>
+    <w:lvl w:ilvl="4" w:tplc="04090003" w:tentative="1">
+      <w:start w:val="1"/>
+      <w:numFmt w:val="bullet"/>
+      <w:lvlText w:val="o"/>
+      <w:lvlJc w:val="left"/>
+      <w:pPr>
+        <w:ind w:left="4320" w:hanging="360"/>
+      </w:pPr>
+      <w:rPr>
+        <w:rFonts w:ascii="Courier New" w:hAnsi="Courier New" w:cs="Courier New" w:hint="default"/>
+      </w:rPr>
+    </w:lvl>
+    <w:lvl w:ilvl="5" w:tplc="04090005" w:tentative="1">
+      <w:start w:val="1"/>
+      <w:numFmt w:val="bullet"/>
+      <w:lvlText w:val=""/>
+      <w:lvlJc w:val="left"/>
+      <w:pPr>
+        <w:ind w:left="5040" w:hanging="360"/>
+      </w:pPr>
+      <w:rPr>
+        <w:rFonts w:ascii="Wingdings" w:hAnsi="Wingdings" w:hint="default"/>
+      </w:rPr>
+    </w:lvl>
+    <w:lvl w:ilvl="6" w:tplc="04090001" w:tentative="1">
+      <w:start w:val="1"/>
+      <w:numFmt w:val="bullet"/>
+      <w:lvlText w:val=""/>
+      <w:lvlJc w:val="left"/>
+      <w:pPr>
+        <w:ind w:left="5760" w:hanging="360"/>
+      </w:pPr>
+      <w:rPr>
+        <w:rFonts w:ascii="Symbol" w:hAnsi="Symbol" w:hint="default"/>
+      </w:rPr>
+    </w:lvl>
+    <w:lvl w:ilvl="7" w:tplc="04090003" w:tentative="1">
+      <w:start w:val="1"/>
+      <w:numFmt w:val="bullet"/>
+      <w:lvlText w:val="o"/>
+      <w:lvlJc w:val="left"/>
+      <w:pPr>
+        <w:ind w:left="6480" w:hanging="360"/>
+      </w:pPr>
+      <w:rPr>
+        <w:rFonts w:ascii="Courier New" w:hAnsi="Courier New" w:cs="Courier New" w:hint="default"/>
+      </w:rPr>
+    </w:lvl>
+    <w:lvl w:ilvl="8" w:tplc="04090005" w:tentative="1">
+      <w:start w:val="1"/>
+      <w:numFmt w:val="bullet"/>
+      <w:lvlText w:val=""/>
+      <w:lvlJc w:val="left"/>
+      <w:pPr>
+        <w:ind w:left="7200" w:hanging="360"/>
+      </w:pPr>
+      <w:rPr>
+        <w:rFonts w:ascii="Wingdings" w:hAnsi="Wingdings" w:hint="default"/>
+      </w:rPr>
+    </w:lvl>
+  </w:abstractNum>
+  <w:num w:numId="1" w16cid:durableId="154806368">
+    <w:abstractNumId w:val="1"/>
+  </w:num>
+  <w:num w:numId="2" w16cid:durableId="578439991">
+    <w:abstractNumId w:val="4"/>
+  </w:num>
+  <w:num w:numId="3" w16cid:durableId="1812281206">
+    <w:abstractNumId w:val="5"/>
+  </w:num>
+  <w:num w:numId="4" w16cid:durableId="1061051469">
+    <w:abstractNumId w:val="3"/>
+  </w:num>
+  <w:num w:numId="5" w16cid:durableId="989677303">
+    <w:abstractNumId w:val="2"/>
+  </w:num>
+  <w:num w:numId="6" w16cid:durableId="2076196694">
+    <w:abstractNumId w:val="0"/>
+  </w:num>
+</w:numbering>
 </file>
 
 <file path=word/styles.xml><?xml version="1.0" encoding="utf-8"?>
@@ -1062,7 +2915,6 @@
   <w:style w:type="character" w:default="1" w:styleId="DefaultParagraphFont">
     <w:name w:val="Default Paragraph Font"/>
     <w:uiPriority w:val="1"/>
-    <w:semiHidden/>
     <w:unhideWhenUsed/>
   </w:style>
   <w:style w:type="table" w:default="1" w:styleId="TableNormal">
@@ -1397,6 +3249,29 @@
     <w:link w:val="Footer"/>
     <w:uiPriority w:val="99"/>
     <w:rsid w:val="009B5619"/>
+  </w:style>
+  <w:style w:type="character" w:styleId="Hyperlink">
+    <w:name w:val="Hyperlink"/>
+    <w:basedOn w:val="DefaultParagraphFont"/>
+    <w:uiPriority w:val="99"/>
+    <w:unhideWhenUsed/>
+    <w:rsid w:val="00A06236"/>
+    <w:rPr>
+      <w:color w:val="467886" w:themeColor="hyperlink"/>
+      <w:u w:val="single"/>
+    </w:rPr>
+  </w:style>
+  <w:style w:type="character" w:styleId="UnresolvedMention">
+    <w:name w:val="Unresolved Mention"/>
+    <w:basedOn w:val="DefaultParagraphFont"/>
+    <w:uiPriority w:val="99"/>
+    <w:semiHidden/>
+    <w:unhideWhenUsed/>
+    <w:rsid w:val="00A06236"/>
+    <w:rPr>
+      <w:color w:val="605E5C"/>
+      <w:shd w:val="clear" w:color="auto" w:fill="E1DFDD"/>
+    </w:rPr>
   </w:style>
 </w:styles>
 </file>

</xml_diff>